<commit_message>
Sprint 4 documentazione + errori con desc
</commit_message>
<xml_diff>
--- a/3_Documentazione/Documentazione_Sprint4.docx
+++ b/3_Documentazione/Documentazione_Sprint4.docx
@@ -1099,7 +1099,15 @@
         <w:t xml:space="preserve"> di questo sprint è</w:t>
       </w:r>
       <w:r>
-        <w:t xml:space="preserve"> l’implementazione, anche se con </w:t>
+        <w:t xml:space="preserve"> l’implementazione</w:t>
+      </w:r>
+      <w:r>
+        <w:t xml:space="preserve"> e la sicurezza</w:t>
+      </w:r>
+      <w:bookmarkStart w:id="1" w:name="_GoBack"/>
+      <w:bookmarkEnd w:id="1"/>
+      <w:r>
+        <w:t xml:space="preserve">, anche se con </w:t>
       </w:r>
       <w:r>
         <w:t>qualche</w:t>
@@ -1112,7 +1120,7 @@
       <w:pPr>
         <w:pStyle w:val="Titolo1"/>
       </w:pPr>
-      <w:bookmarkStart w:id="1" w:name="_Toc195706566"/>
+      <w:bookmarkStart w:id="2" w:name="_Toc195706566"/>
       <w:r>
         <w:t xml:space="preserve">Pianificazione </w:t>
       </w:r>
@@ -1120,7 +1128,7 @@
       <w:r>
         <w:t>Gantt</w:t>
       </w:r>
-      <w:bookmarkEnd w:id="1"/>
+      <w:bookmarkEnd w:id="2"/>
       <w:proofErr w:type="spellEnd"/>
     </w:p>
     <w:p>
@@ -1172,65 +1180,70 @@
       <w:pPr>
         <w:pStyle w:val="Titolo1"/>
       </w:pPr>
-      <w:bookmarkStart w:id="2" w:name="_Toc195706567"/>
+      <w:bookmarkStart w:id="3" w:name="_Toc195706567"/>
       <w:r>
         <w:lastRenderedPageBreak/>
         <w:t>Implementazione</w:t>
-      </w:r>
-      <w:bookmarkEnd w:id="2"/>
-    </w:p>
-    <w:p>
-      <w:pPr>
-        <w:pStyle w:val="Titolo2"/>
-      </w:pPr>
-      <w:bookmarkStart w:id="3" w:name="_Toc195706568"/>
-      <w:r>
-        <w:t>Documentazione</w:t>
       </w:r>
       <w:bookmarkEnd w:id="3"/>
     </w:p>
     <w:p>
-      <w:r>
-        <w:t>Lasciata come obbiettivo secondario.</w:t>
-      </w:r>
-    </w:p>
-    <w:p>
       <w:pPr>
         <w:pStyle w:val="Titolo2"/>
       </w:pPr>
-      <w:bookmarkStart w:id="4" w:name="_Toc195706569"/>
-      <w:r>
-        <w:t>Database</w:t>
+      <w:bookmarkStart w:id="4" w:name="_Toc195706568"/>
+      <w:r>
+        <w:t>Documentazione</w:t>
       </w:r>
       <w:bookmarkEnd w:id="4"/>
     </w:p>
     <w:p>
       <w:r>
-        <w:t xml:space="preserve">Per il database </w:t>
-      </w:r>
-      <w:r>
-        <w:t>abbiamo aggiunto la relazione tra utente e nota, inoltre abbiamo aggiunto la tabella degli attachments.</w:t>
+        <w:t>Lasciata come obbiettivo secondario.</w:t>
       </w:r>
     </w:p>
     <w:p>
       <w:pPr>
         <w:pStyle w:val="Titolo2"/>
       </w:pPr>
-      <w:bookmarkStart w:id="5" w:name="_Toc195706570"/>
-      <w:r>
-        <w:t>Funzionalità</w:t>
+      <w:bookmarkStart w:id="5" w:name="_Toc195706569"/>
+      <w:r>
+        <w:t>Database</w:t>
       </w:r>
       <w:bookmarkEnd w:id="5"/>
     </w:p>
     <w:p>
       <w:r>
-        <w:t>Abbiamo migliorato gestione dell’email per login/registrazione</w:t>
-      </w:r>
-      <w:r>
-        <w:t>:</w:t>
-      </w:r>
-      <w:r>
-        <w:t xml:space="preserve"> </w:t>
+        <w:t xml:space="preserve">Per il database </w:t>
+      </w:r>
+      <w:r>
+        <w:t xml:space="preserve">abbiamo aggiunto </w:t>
+      </w:r>
+      <w:r>
+        <w:t>la cifratura del database</w:t>
+      </w:r>
+      <w:r>
+        <w:t xml:space="preserve">, dove i dati vengono cifrati con </w:t>
+      </w:r>
+    </w:p>
+    <w:p>
+      <w:pPr>
+        <w:pStyle w:val="Titolo2"/>
+      </w:pPr>
+      <w:bookmarkStart w:id="6" w:name="_Toc195706570"/>
+      <w:r>
+        <w:t>Funzionalità</w:t>
+      </w:r>
+      <w:bookmarkEnd w:id="6"/>
+    </w:p>
+    <w:p>
+      <w:r>
+        <w:t>In questo sprint abbiamo aggiunto alcune sicurezze oltre ad implementare nuove funzionalità:</w:t>
+      </w:r>
+    </w:p>
+    <w:p>
+      <w:r>
+        <w:t>Note:</w:t>
       </w:r>
     </w:p>
     <w:p>
@@ -1238,54 +1251,39 @@
         <w:pStyle w:val="Paragrafoelenco"/>
         <w:numPr>
           <w:ilvl w:val="0"/>
-          <w:numId w:val="7"/>
+          <w:numId w:val="16"/>
         </w:numPr>
       </w:pPr>
       <w:r>
-        <w:t>Creazione della nota</w:t>
+        <w:t>Implementato Canvas, area di disegno</w:t>
       </w:r>
     </w:p>
     <w:p>
       <w:pPr>
         <w:pStyle w:val="Paragrafoelenco"/>
         <w:numPr>
-          <w:ilvl w:val="1"/>
-          <w:numId w:val="7"/>
+          <w:ilvl w:val="0"/>
+          <w:numId w:val="16"/>
         </w:numPr>
       </w:pPr>
       <w:r>
-        <w:t>S</w:t>
-      </w:r>
-      <w:r>
-        <w:t>alvataggio di attachments, problemi nel salvataggio e nella relazione nel DB</w:t>
+        <w:t>Mostrare gli attachments salvati</w:t>
       </w:r>
     </w:p>
     <w:p>
       <w:pPr>
         <w:pStyle w:val="Paragrafoelenco"/>
         <w:numPr>
-          <w:ilvl w:val="1"/>
-          <w:numId w:val="7"/>
+          <w:ilvl w:val="0"/>
+          <w:numId w:val="16"/>
         </w:numPr>
       </w:pPr>
       <w:r>
-        <w:t>Tipi Attachments:</w:t>
-      </w:r>
-    </w:p>
-    <w:p>
-      <w:pPr>
-        <w:pStyle w:val="Paragrafoelenco"/>
-        <w:numPr>
-          <w:ilvl w:val="2"/>
-          <w:numId w:val="7"/>
-        </w:numPr>
-      </w:pPr>
-      <w:r>
-        <w:t>testo -&gt; .</w:t>
+        <w:t xml:space="preserve">Risolto problema responsive </w:t>
       </w:r>
       <w:proofErr w:type="spellStart"/>
       <w:r>
-        <w:t>txt</w:t>
+        <w:t>navbar</w:t>
       </w:r>
       <w:proofErr w:type="spellEnd"/>
     </w:p>
@@ -1293,29 +1291,18 @@
       <w:pPr>
         <w:pStyle w:val="Paragrafoelenco"/>
         <w:numPr>
-          <w:ilvl w:val="2"/>
-          <w:numId w:val="7"/>
+          <w:ilvl w:val="0"/>
+          <w:numId w:val="16"/>
         </w:numPr>
       </w:pPr>
       <w:r>
-        <w:t xml:space="preserve">Canvas (da completare) -&gt; </w:t>
-      </w:r>
-      <w:proofErr w:type="spellStart"/>
-      <w:r>
-        <w:t>png</w:t>
-      </w:r>
-      <w:proofErr w:type="spellEnd"/>
-    </w:p>
-    <w:p>
-      <w:pPr>
-        <w:pStyle w:val="Paragrafoelenco"/>
-        <w:numPr>
-          <w:ilvl w:val="2"/>
-          <w:numId w:val="7"/>
-        </w:numPr>
-      </w:pPr>
-      <w:r>
-        <w:t>allegato</w:t>
+        <w:t>Eliminare allegati nota, quando s</w:t>
+      </w:r>
+      <w:r>
+        <w:t>i</w:t>
+      </w:r>
+      <w:r>
+        <w:t xml:space="preserve"> elimina una nota (Fatto solo su DB)</w:t>
       </w:r>
     </w:p>
     <w:p>
@@ -1323,35 +1310,11 @@
         <w:pStyle w:val="Paragrafoelenco"/>
         <w:numPr>
           <w:ilvl w:val="0"/>
-          <w:numId w:val="7"/>
+          <w:numId w:val="16"/>
         </w:numPr>
       </w:pPr>
       <w:r>
-        <w:t xml:space="preserve">Elenco delle note </w:t>
-      </w:r>
-    </w:p>
-    <w:p>
-      <w:pPr>
-        <w:pStyle w:val="Paragrafoelenco"/>
-        <w:numPr>
-          <w:ilvl w:val="1"/>
-          <w:numId w:val="7"/>
-        </w:numPr>
-      </w:pPr>
-      <w:r>
-        <w:t>Filtro nota più / meno recente</w:t>
-      </w:r>
-    </w:p>
-    <w:p>
-      <w:pPr>
-        <w:pStyle w:val="Paragrafoelenco"/>
-        <w:numPr>
-          <w:ilvl w:val="1"/>
-          <w:numId w:val="7"/>
-        </w:numPr>
-      </w:pPr>
-      <w:r>
-        <w:t>Data creazione e ultimo aggiornamento</w:t>
+        <w:t>Eliminare singolo allegato</w:t>
       </w:r>
     </w:p>
     <w:p>
@@ -1359,69 +1322,111 @@
         <w:pStyle w:val="Paragrafoelenco"/>
         <w:numPr>
           <w:ilvl w:val="0"/>
-          <w:numId w:val="7"/>
+          <w:numId w:val="16"/>
         </w:numPr>
       </w:pPr>
       <w:r>
-        <w:t>Profilo utente:</w:t>
+        <w:t>Download note in file ZIP</w:t>
       </w:r>
     </w:p>
     <w:p>
+      <w:r>
+        <w:t>Sicurezze:</w:t>
+      </w:r>
+    </w:p>
+    <w:p>
       <w:pPr>
         <w:pStyle w:val="Paragrafoelenco"/>
         <w:numPr>
-          <w:ilvl w:val="1"/>
-          <w:numId w:val="7"/>
+          <w:ilvl w:val="0"/>
+          <w:numId w:val="17"/>
         </w:numPr>
       </w:pPr>
       <w:r>
-        <w:t>Eliminazione account</w:t>
+        <w:t>Sicurezza del link, non posso navigare dove voglio senza aver fatto login o registrazione</w:t>
       </w:r>
     </w:p>
     <w:p>
       <w:pPr>
         <w:pStyle w:val="Paragrafoelenco"/>
         <w:numPr>
-          <w:ilvl w:val="1"/>
-          <w:numId w:val="7"/>
+          <w:ilvl w:val="0"/>
+          <w:numId w:val="17"/>
         </w:numPr>
       </w:pPr>
       <w:r>
-        <w:t>Modifica nome utente</w:t>
+        <w:t>Cifratura dati DB</w:t>
       </w:r>
     </w:p>
     <w:p>
       <w:pPr>
         <w:pStyle w:val="Paragrafoelenco"/>
         <w:numPr>
-          <w:ilvl w:val="1"/>
-          <w:numId w:val="7"/>
+          <w:ilvl w:val="0"/>
+          <w:numId w:val="17"/>
         </w:numPr>
       </w:pPr>
       <w:r>
-        <w:t>Modifica della password, richiesta vecchia password</w:t>
+        <w:t>Sicurezza password, aggiunti i criteri</w:t>
       </w:r>
     </w:p>
     <w:p>
       <w:pPr>
         <w:pStyle w:val="Paragrafoelenco"/>
         <w:numPr>
-          <w:ilvl w:val="1"/>
-          <w:numId w:val="7"/>
+          <w:ilvl w:val="0"/>
+          <w:numId w:val="17"/>
         </w:numPr>
       </w:pPr>
       <w:r>
-        <w:t>Utente ha un'unica mail che deve essere valida</w:t>
-      </w:r>
-      <w:bookmarkStart w:id="6" w:name="_GoBack"/>
-      <w:bookmarkEnd w:id="6"/>
+        <w:t>Errori con una breve descrizione del problema che si è generato</w:t>
+      </w:r>
     </w:p>
     <w:p>
+      <w:r>
+        <w:t xml:space="preserve">Generali: </w:t>
+      </w:r>
+    </w:p>
+    <w:p>
       <w:pPr>
         <w:pStyle w:val="Paragrafoelenco"/>
-        <w:ind w:left="1440"/>
-      </w:pPr>
+        <w:numPr>
+          <w:ilvl w:val="0"/>
+          <w:numId w:val="18"/>
+        </w:numPr>
+      </w:pPr>
+      <w:r>
+        <w:t>Cambiato disposizione di pagina profilo utente</w:t>
+      </w:r>
     </w:p>
+    <w:p>
+      <w:pPr>
+        <w:pStyle w:val="Paragrafoelenco"/>
+        <w:numPr>
+          <w:ilvl w:val="0"/>
+          <w:numId w:val="18"/>
+        </w:numPr>
+      </w:pPr>
+      <w:r>
+        <w:t>Aggiunto la visualizzazione del proprio nome utente e della propria mail</w:t>
+      </w:r>
+    </w:p>
+    <w:p>
+      <w:pPr>
+        <w:pStyle w:val="Paragrafoelenco"/>
+        <w:numPr>
+          <w:ilvl w:val="0"/>
+          <w:numId w:val="18"/>
+        </w:numPr>
+      </w:pPr>
+      <w:r>
+        <w:t>Aggiunto criteri password anche nella pagina profilo</w:t>
+      </w:r>
+    </w:p>
+    <w:p/>
+    <w:p/>
+    <w:p/>
+    <w:p/>
     <w:p/>
     <w:p/>
     <w:p/>
@@ -1566,7 +1571,7 @@
       <w:rPr>
         <w:noProof/>
       </w:rPr>
-      <w:t>07.05.2025</w:t>
+      <w:t>14.05.2025</w:t>
     </w:r>
     <w:r>
       <w:fldChar w:fldCharType="end"/>
@@ -1777,6 +1782,92 @@
     </w:lvl>
   </w:abstractNum>
   <w:abstractNum w:abstractNumId="2" w15:restartNumberingAfterBreak="0">
+    <w:nsid w:val="051646FA"/>
+    <w:multiLevelType w:val="hybridMultilevel"/>
+    <w:tmpl w:val="4B62628C"/>
+    <w:lvl w:ilvl="0" w:tplc="0810000F">
+      <w:start w:val="1"/>
+      <w:numFmt w:val="decimal"/>
+      <w:lvlText w:val="%1."/>
+      <w:lvlJc w:val="left"/>
+      <w:pPr>
+        <w:ind w:left="720" w:hanging="360"/>
+      </w:pPr>
+    </w:lvl>
+    <w:lvl w:ilvl="1" w:tplc="08100019" w:tentative="1">
+      <w:start w:val="1"/>
+      <w:numFmt w:val="lowerLetter"/>
+      <w:lvlText w:val="%2."/>
+      <w:lvlJc w:val="left"/>
+      <w:pPr>
+        <w:ind w:left="1440" w:hanging="360"/>
+      </w:pPr>
+    </w:lvl>
+    <w:lvl w:ilvl="2" w:tplc="0810001B" w:tentative="1">
+      <w:start w:val="1"/>
+      <w:numFmt w:val="lowerRoman"/>
+      <w:lvlText w:val="%3."/>
+      <w:lvlJc w:val="right"/>
+      <w:pPr>
+        <w:ind w:left="2160" w:hanging="180"/>
+      </w:pPr>
+    </w:lvl>
+    <w:lvl w:ilvl="3" w:tplc="0810000F" w:tentative="1">
+      <w:start w:val="1"/>
+      <w:numFmt w:val="decimal"/>
+      <w:lvlText w:val="%4."/>
+      <w:lvlJc w:val="left"/>
+      <w:pPr>
+        <w:ind w:left="2880" w:hanging="360"/>
+      </w:pPr>
+    </w:lvl>
+    <w:lvl w:ilvl="4" w:tplc="08100019" w:tentative="1">
+      <w:start w:val="1"/>
+      <w:numFmt w:val="lowerLetter"/>
+      <w:lvlText w:val="%5."/>
+      <w:lvlJc w:val="left"/>
+      <w:pPr>
+        <w:ind w:left="3600" w:hanging="360"/>
+      </w:pPr>
+    </w:lvl>
+    <w:lvl w:ilvl="5" w:tplc="0810001B" w:tentative="1">
+      <w:start w:val="1"/>
+      <w:numFmt w:val="lowerRoman"/>
+      <w:lvlText w:val="%6."/>
+      <w:lvlJc w:val="right"/>
+      <w:pPr>
+        <w:ind w:left="4320" w:hanging="180"/>
+      </w:pPr>
+    </w:lvl>
+    <w:lvl w:ilvl="6" w:tplc="0810000F" w:tentative="1">
+      <w:start w:val="1"/>
+      <w:numFmt w:val="decimal"/>
+      <w:lvlText w:val="%7."/>
+      <w:lvlJc w:val="left"/>
+      <w:pPr>
+        <w:ind w:left="5040" w:hanging="360"/>
+      </w:pPr>
+    </w:lvl>
+    <w:lvl w:ilvl="7" w:tplc="08100019" w:tentative="1">
+      <w:start w:val="1"/>
+      <w:numFmt w:val="lowerLetter"/>
+      <w:lvlText w:val="%8."/>
+      <w:lvlJc w:val="left"/>
+      <w:pPr>
+        <w:ind w:left="5760" w:hanging="360"/>
+      </w:pPr>
+    </w:lvl>
+    <w:lvl w:ilvl="8" w:tplc="0810001B" w:tentative="1">
+      <w:start w:val="1"/>
+      <w:numFmt w:val="lowerRoman"/>
+      <w:lvlText w:val="%9."/>
+      <w:lvlJc w:val="right"/>
+      <w:pPr>
+        <w:ind w:left="6480" w:hanging="180"/>
+      </w:pPr>
+    </w:lvl>
+  </w:abstractNum>
+  <w:abstractNum w:abstractNumId="3" w15:restartNumberingAfterBreak="0">
     <w:nsid w:val="0518192E"/>
     <w:multiLevelType w:val="hybridMultilevel"/>
     <w:tmpl w:val="5D76F6D0"/>
@@ -1862,7 +1953,7 @@
       </w:pPr>
     </w:lvl>
   </w:abstractNum>
-  <w:abstractNum w:abstractNumId="3" w15:restartNumberingAfterBreak="0">
+  <w:abstractNum w:abstractNumId="4" w15:restartNumberingAfterBreak="0">
     <w:nsid w:val="06452FB1"/>
     <w:multiLevelType w:val="hybridMultilevel"/>
     <w:tmpl w:val="57BE699C"/>
@@ -1948,7 +2039,7 @@
       </w:pPr>
     </w:lvl>
   </w:abstractNum>
-  <w:abstractNum w:abstractNumId="4" w15:restartNumberingAfterBreak="0">
+  <w:abstractNum w:abstractNumId="5" w15:restartNumberingAfterBreak="0">
     <w:nsid w:val="0801489A"/>
     <w:multiLevelType w:val="hybridMultilevel"/>
     <w:tmpl w:val="F3A21FFC"/>
@@ -2061,7 +2152,7 @@
       </w:pPr>
     </w:lvl>
   </w:abstractNum>
-  <w:abstractNum w:abstractNumId="5" w15:restartNumberingAfterBreak="0">
+  <w:abstractNum w:abstractNumId="6" w15:restartNumberingAfterBreak="0">
     <w:nsid w:val="22AE1947"/>
     <w:multiLevelType w:val="hybridMultilevel"/>
     <w:tmpl w:val="FD3A4378"/>
@@ -2147,7 +2238,93 @@
       </w:pPr>
     </w:lvl>
   </w:abstractNum>
-  <w:abstractNum w:abstractNumId="6" w15:restartNumberingAfterBreak="0">
+  <w:abstractNum w:abstractNumId="7" w15:restartNumberingAfterBreak="0">
+    <w:nsid w:val="2855044D"/>
+    <w:multiLevelType w:val="hybridMultilevel"/>
+    <w:tmpl w:val="37FE5388"/>
+    <w:lvl w:ilvl="0" w:tplc="0810000F">
+      <w:start w:val="1"/>
+      <w:numFmt w:val="decimal"/>
+      <w:lvlText w:val="%1."/>
+      <w:lvlJc w:val="left"/>
+      <w:pPr>
+        <w:ind w:left="720" w:hanging="360"/>
+      </w:pPr>
+    </w:lvl>
+    <w:lvl w:ilvl="1" w:tplc="08100019" w:tentative="1">
+      <w:start w:val="1"/>
+      <w:numFmt w:val="lowerLetter"/>
+      <w:lvlText w:val="%2."/>
+      <w:lvlJc w:val="left"/>
+      <w:pPr>
+        <w:ind w:left="1440" w:hanging="360"/>
+      </w:pPr>
+    </w:lvl>
+    <w:lvl w:ilvl="2" w:tplc="0810001B" w:tentative="1">
+      <w:start w:val="1"/>
+      <w:numFmt w:val="lowerRoman"/>
+      <w:lvlText w:val="%3."/>
+      <w:lvlJc w:val="right"/>
+      <w:pPr>
+        <w:ind w:left="2160" w:hanging="180"/>
+      </w:pPr>
+    </w:lvl>
+    <w:lvl w:ilvl="3" w:tplc="0810000F" w:tentative="1">
+      <w:start w:val="1"/>
+      <w:numFmt w:val="decimal"/>
+      <w:lvlText w:val="%4."/>
+      <w:lvlJc w:val="left"/>
+      <w:pPr>
+        <w:ind w:left="2880" w:hanging="360"/>
+      </w:pPr>
+    </w:lvl>
+    <w:lvl w:ilvl="4" w:tplc="08100019" w:tentative="1">
+      <w:start w:val="1"/>
+      <w:numFmt w:val="lowerLetter"/>
+      <w:lvlText w:val="%5."/>
+      <w:lvlJc w:val="left"/>
+      <w:pPr>
+        <w:ind w:left="3600" w:hanging="360"/>
+      </w:pPr>
+    </w:lvl>
+    <w:lvl w:ilvl="5" w:tplc="0810001B" w:tentative="1">
+      <w:start w:val="1"/>
+      <w:numFmt w:val="lowerRoman"/>
+      <w:lvlText w:val="%6."/>
+      <w:lvlJc w:val="right"/>
+      <w:pPr>
+        <w:ind w:left="4320" w:hanging="180"/>
+      </w:pPr>
+    </w:lvl>
+    <w:lvl w:ilvl="6" w:tplc="0810000F" w:tentative="1">
+      <w:start w:val="1"/>
+      <w:numFmt w:val="decimal"/>
+      <w:lvlText w:val="%7."/>
+      <w:lvlJc w:val="left"/>
+      <w:pPr>
+        <w:ind w:left="5040" w:hanging="360"/>
+      </w:pPr>
+    </w:lvl>
+    <w:lvl w:ilvl="7" w:tplc="08100019" w:tentative="1">
+      <w:start w:val="1"/>
+      <w:numFmt w:val="lowerLetter"/>
+      <w:lvlText w:val="%8."/>
+      <w:lvlJc w:val="left"/>
+      <w:pPr>
+        <w:ind w:left="5760" w:hanging="360"/>
+      </w:pPr>
+    </w:lvl>
+    <w:lvl w:ilvl="8" w:tplc="0810001B" w:tentative="1">
+      <w:start w:val="1"/>
+      <w:numFmt w:val="lowerRoman"/>
+      <w:lvlText w:val="%9."/>
+      <w:lvlJc w:val="right"/>
+      <w:pPr>
+        <w:ind w:left="6480" w:hanging="180"/>
+      </w:pPr>
+    </w:lvl>
+  </w:abstractNum>
+  <w:abstractNum w:abstractNumId="8" w15:restartNumberingAfterBreak="0">
     <w:nsid w:val="33B616E1"/>
     <w:multiLevelType w:val="hybridMultilevel"/>
     <w:tmpl w:val="5D76F6D0"/>
@@ -2233,7 +2410,7 @@
       </w:pPr>
     </w:lvl>
   </w:abstractNum>
-  <w:abstractNum w:abstractNumId="7" w15:restartNumberingAfterBreak="0">
+  <w:abstractNum w:abstractNumId="9" w15:restartNumberingAfterBreak="0">
     <w:nsid w:val="441E0853"/>
     <w:multiLevelType w:val="hybridMultilevel"/>
     <w:tmpl w:val="57BE699C"/>
@@ -2319,7 +2496,7 @@
       </w:pPr>
     </w:lvl>
   </w:abstractNum>
-  <w:abstractNum w:abstractNumId="8" w15:restartNumberingAfterBreak="0">
+  <w:abstractNum w:abstractNumId="10" w15:restartNumberingAfterBreak="0">
     <w:nsid w:val="4F1F24FA"/>
     <w:multiLevelType w:val="hybridMultilevel"/>
     <w:tmpl w:val="57BE699C"/>
@@ -2405,7 +2582,7 @@
       </w:pPr>
     </w:lvl>
   </w:abstractNum>
-  <w:abstractNum w:abstractNumId="9" w15:restartNumberingAfterBreak="0">
+  <w:abstractNum w:abstractNumId="11" w15:restartNumberingAfterBreak="0">
     <w:nsid w:val="4F361C72"/>
     <w:multiLevelType w:val="hybridMultilevel"/>
     <w:tmpl w:val="E88C01D8"/>
@@ -2491,7 +2668,7 @@
       </w:pPr>
     </w:lvl>
   </w:abstractNum>
-  <w:abstractNum w:abstractNumId="10" w15:restartNumberingAfterBreak="0">
+  <w:abstractNum w:abstractNumId="12" w15:restartNumberingAfterBreak="0">
     <w:nsid w:val="50F03F2E"/>
     <w:multiLevelType w:val="hybridMultilevel"/>
     <w:tmpl w:val="57BE699C"/>
@@ -2577,7 +2754,93 @@
       </w:pPr>
     </w:lvl>
   </w:abstractNum>
-  <w:abstractNum w:abstractNumId="11" w15:restartNumberingAfterBreak="0">
+  <w:abstractNum w:abstractNumId="13" w15:restartNumberingAfterBreak="0">
+    <w:nsid w:val="52887F33"/>
+    <w:multiLevelType w:val="hybridMultilevel"/>
+    <w:tmpl w:val="1D6893C2"/>
+    <w:lvl w:ilvl="0" w:tplc="0810000F">
+      <w:start w:val="1"/>
+      <w:numFmt w:val="decimal"/>
+      <w:lvlText w:val="%1."/>
+      <w:lvlJc w:val="left"/>
+      <w:pPr>
+        <w:ind w:left="720" w:hanging="360"/>
+      </w:pPr>
+    </w:lvl>
+    <w:lvl w:ilvl="1" w:tplc="08100019" w:tentative="1">
+      <w:start w:val="1"/>
+      <w:numFmt w:val="lowerLetter"/>
+      <w:lvlText w:val="%2."/>
+      <w:lvlJc w:val="left"/>
+      <w:pPr>
+        <w:ind w:left="1440" w:hanging="360"/>
+      </w:pPr>
+    </w:lvl>
+    <w:lvl w:ilvl="2" w:tplc="0810001B" w:tentative="1">
+      <w:start w:val="1"/>
+      <w:numFmt w:val="lowerRoman"/>
+      <w:lvlText w:val="%3."/>
+      <w:lvlJc w:val="right"/>
+      <w:pPr>
+        <w:ind w:left="2160" w:hanging="180"/>
+      </w:pPr>
+    </w:lvl>
+    <w:lvl w:ilvl="3" w:tplc="0810000F" w:tentative="1">
+      <w:start w:val="1"/>
+      <w:numFmt w:val="decimal"/>
+      <w:lvlText w:val="%4."/>
+      <w:lvlJc w:val="left"/>
+      <w:pPr>
+        <w:ind w:left="2880" w:hanging="360"/>
+      </w:pPr>
+    </w:lvl>
+    <w:lvl w:ilvl="4" w:tplc="08100019" w:tentative="1">
+      <w:start w:val="1"/>
+      <w:numFmt w:val="lowerLetter"/>
+      <w:lvlText w:val="%5."/>
+      <w:lvlJc w:val="left"/>
+      <w:pPr>
+        <w:ind w:left="3600" w:hanging="360"/>
+      </w:pPr>
+    </w:lvl>
+    <w:lvl w:ilvl="5" w:tplc="0810001B" w:tentative="1">
+      <w:start w:val="1"/>
+      <w:numFmt w:val="lowerRoman"/>
+      <w:lvlText w:val="%6."/>
+      <w:lvlJc w:val="right"/>
+      <w:pPr>
+        <w:ind w:left="4320" w:hanging="180"/>
+      </w:pPr>
+    </w:lvl>
+    <w:lvl w:ilvl="6" w:tplc="0810000F" w:tentative="1">
+      <w:start w:val="1"/>
+      <w:numFmt w:val="decimal"/>
+      <w:lvlText w:val="%7."/>
+      <w:lvlJc w:val="left"/>
+      <w:pPr>
+        <w:ind w:left="5040" w:hanging="360"/>
+      </w:pPr>
+    </w:lvl>
+    <w:lvl w:ilvl="7" w:tplc="08100019" w:tentative="1">
+      <w:start w:val="1"/>
+      <w:numFmt w:val="lowerLetter"/>
+      <w:lvlText w:val="%8."/>
+      <w:lvlJc w:val="left"/>
+      <w:pPr>
+        <w:ind w:left="5760" w:hanging="360"/>
+      </w:pPr>
+    </w:lvl>
+    <w:lvl w:ilvl="8" w:tplc="0810001B" w:tentative="1">
+      <w:start w:val="1"/>
+      <w:numFmt w:val="lowerRoman"/>
+      <w:lvlText w:val="%9."/>
+      <w:lvlJc w:val="right"/>
+      <w:pPr>
+        <w:ind w:left="6480" w:hanging="180"/>
+      </w:pPr>
+    </w:lvl>
+  </w:abstractNum>
+  <w:abstractNum w:abstractNumId="14" w15:restartNumberingAfterBreak="0">
     <w:nsid w:val="58F73537"/>
     <w:multiLevelType w:val="hybridMultilevel"/>
     <w:tmpl w:val="E88C01D8"/>
@@ -2663,7 +2926,7 @@
       </w:pPr>
     </w:lvl>
   </w:abstractNum>
-  <w:abstractNum w:abstractNumId="12" w15:restartNumberingAfterBreak="0">
+  <w:abstractNum w:abstractNumId="15" w15:restartNumberingAfterBreak="0">
     <w:nsid w:val="5C4812BE"/>
     <w:multiLevelType w:val="hybridMultilevel"/>
     <w:tmpl w:val="5D76F6D0"/>
@@ -2749,7 +3012,7 @@
       </w:pPr>
     </w:lvl>
   </w:abstractNum>
-  <w:abstractNum w:abstractNumId="13" w15:restartNumberingAfterBreak="0">
+  <w:abstractNum w:abstractNumId="16" w15:restartNumberingAfterBreak="0">
     <w:nsid w:val="64002B5C"/>
     <w:multiLevelType w:val="hybridMultilevel"/>
     <w:tmpl w:val="57BE699C"/>
@@ -2835,7 +3098,7 @@
       </w:pPr>
     </w:lvl>
   </w:abstractNum>
-  <w:abstractNum w:abstractNumId="14" w15:restartNumberingAfterBreak="0">
+  <w:abstractNum w:abstractNumId="17" w15:restartNumberingAfterBreak="0">
     <w:nsid w:val="75813439"/>
     <w:multiLevelType w:val="hybridMultilevel"/>
     <w:tmpl w:val="5D76F6D0"/>
@@ -2922,49 +3185,58 @@
     </w:lvl>
   </w:abstractNum>
   <w:num w:numId="1">
-    <w:abstractNumId w:val="14"/>
+    <w:abstractNumId w:val="17"/>
   </w:num>
   <w:num w:numId="2">
-    <w:abstractNumId w:val="12"/>
+    <w:abstractNumId w:val="15"/>
   </w:num>
   <w:num w:numId="3">
-    <w:abstractNumId w:val="2"/>
+    <w:abstractNumId w:val="3"/>
   </w:num>
   <w:num w:numId="4">
-    <w:abstractNumId w:val="6"/>
+    <w:abstractNumId w:val="8"/>
   </w:num>
   <w:num w:numId="5">
-    <w:abstractNumId w:val="9"/>
+    <w:abstractNumId w:val="11"/>
   </w:num>
   <w:num w:numId="6">
-    <w:abstractNumId w:val="5"/>
+    <w:abstractNumId w:val="6"/>
   </w:num>
   <w:num w:numId="7">
     <w:abstractNumId w:val="1"/>
   </w:num>
   <w:num w:numId="8">
-    <w:abstractNumId w:val="11"/>
+    <w:abstractNumId w:val="14"/>
   </w:num>
   <w:num w:numId="9">
-    <w:abstractNumId w:val="13"/>
+    <w:abstractNumId w:val="16"/>
   </w:num>
   <w:num w:numId="10">
-    <w:abstractNumId w:val="8"/>
+    <w:abstractNumId w:val="10"/>
   </w:num>
   <w:num w:numId="11">
-    <w:abstractNumId w:val="10"/>
+    <w:abstractNumId w:val="12"/>
   </w:num>
   <w:num w:numId="12">
-    <w:abstractNumId w:val="3"/>
+    <w:abstractNumId w:val="4"/>
   </w:num>
   <w:num w:numId="13">
-    <w:abstractNumId w:val="7"/>
+    <w:abstractNumId w:val="9"/>
   </w:num>
   <w:num w:numId="14">
     <w:abstractNumId w:val="0"/>
   </w:num>
   <w:num w:numId="15">
-    <w:abstractNumId w:val="4"/>
+    <w:abstractNumId w:val="5"/>
+  </w:num>
+  <w:num w:numId="16">
+    <w:abstractNumId w:val="7"/>
+  </w:num>
+  <w:num w:numId="17">
+    <w:abstractNumId w:val="2"/>
+  </w:num>
+  <w:num w:numId="18">
+    <w:abstractNumId w:val="13"/>
   </w:num>
 </w:numbering>
 </file>
@@ -4059,7 +4331,7 @@
 </file>
 
 <file path=customXml/itemProps2.xml><?xml version="1.0" encoding="utf-8"?>
-<ds:datastoreItem xmlns:ds="http://schemas.openxmlformats.org/officeDocument/2006/customXml" ds:itemID="{2E9E6F5C-F019-4D95-A9C6-EA05A62A90FE}">
+<ds:datastoreItem xmlns:ds="http://schemas.openxmlformats.org/officeDocument/2006/customXml" ds:itemID="{2848F022-4900-4B02-80B7-28D615317C14}">
   <ds:schemaRefs>
     <ds:schemaRef ds:uri="http://schemas.openxmlformats.org/officeDocument/2006/bibliography"/>
   </ds:schemaRefs>

</xml_diff>